<commit_message>
Ask again on unclear Y/N answers; limit category name and unit length
- ask_yes_no() loops until the answer is Y/YES or N/NO. Before, any answer
  except Y (for example "yes") counted as no and silently cancelled a save.
- add_category() limits names to 15 characters and units to 6, so the
  fixed-width tables stay lined up.

README, viva sheet (64 questions), project report (28 tests) and handbook
updated to match.

Co-Authored-By: Claude Opus 5.5 <noreply@anthropic.com>
Claude-Session: https://claude.ai/code/session_01DGpnhWwohK1ku2D2HQBEpd
</commit_message>
<xml_diff>
--- a/CarbonDataLogger/Project_Report.docx
+++ b/CarbonDataLogger/Project_Report.docx
@@ -8713,7 +8713,7 @@
                 <w:sz w:val="21"/>
                 <w:szCs w:val="21"/>
               </w:rPr>
-              <w:t xml:space="preserve">display_categories()</w:t>
+              <w:t xml:space="preserve">ask_yes_no(prompt)</w:t>
             </w:r>
           </w:p>
         </w:tc>
@@ -8742,7 +8742,7 @@
                 <w:sz w:val="21"/>
                 <w:szCs w:val="21"/>
               </w:rPr>
-              <w:t xml:space="preserve">Shows all categories with their units and factors.</w:t>
+              <w:t xml:space="preserve">Asks a Y/N question again until the answer is Y, YES, N or NO.</w:t>
             </w:r>
           </w:p>
         </w:tc>
@@ -8777,7 +8777,7 @@
                 <w:sz w:val="21"/>
                 <w:szCs w:val="21"/>
               </w:rPr>
-              <w:t xml:space="preserve">get_category(category_id)</w:t>
+              <w:t xml:space="preserve">display_categories()</w:t>
             </w:r>
           </w:p>
         </w:tc>
@@ -8806,7 +8806,7 @@
                 <w:sz w:val="21"/>
                 <w:szCs w:val="21"/>
               </w:rPr>
-              <w:t xml:space="preserve">Fetches one category from MySQL.</w:t>
+              <w:t xml:space="preserve">Shows all categories with their units and factors.</w:t>
             </w:r>
           </w:p>
         </w:tc>
@@ -8841,7 +8841,7 @@
                 <w:sz w:val="21"/>
                 <w:szCs w:val="21"/>
               </w:rPr>
-              <w:t xml:space="preserve">choose_category()</w:t>
+              <w:t xml:space="preserve">get_category(category_id)</w:t>
             </w:r>
           </w:p>
         </w:tc>
@@ -8870,7 +8870,7 @@
                 <w:sz w:val="21"/>
                 <w:szCs w:val="21"/>
               </w:rPr>
-              <w:t xml:space="preserve">Lets the user pick a valid category.</w:t>
+              <w:t xml:space="preserve">Fetches one category from MySQL.</w:t>
             </w:r>
           </w:p>
         </w:tc>
@@ -8905,7 +8905,7 @@
                 <w:sz w:val="21"/>
                 <w:szCs w:val="21"/>
               </w:rPr>
-              <w:t xml:space="preserve">calculate_emission(q, f)</w:t>
+              <w:t xml:space="preserve">choose_category()</w:t>
             </w:r>
           </w:p>
         </w:tc>
@@ -8934,7 +8934,7 @@
                 <w:sz w:val="21"/>
                 <w:szCs w:val="21"/>
               </w:rPr>
-              <w:t xml:space="preserve">Returns quantity × emission factor, rounded to 2 places.</w:t>
+              <w:t xml:space="preserve">Lets the user pick a valid category.</w:t>
             </w:r>
           </w:p>
         </w:tc>
@@ -8969,7 +8969,7 @@
                 <w:sz w:val="21"/>
                 <w:szCs w:val="21"/>
               </w:rPr>
-              <w:t xml:space="preserve">add_record()</w:t>
+              <w:t xml:space="preserve">calculate_emission(q, f)</w:t>
             </w:r>
           </w:p>
         </w:tc>
@@ -8998,7 +8998,7 @@
                 <w:sz w:val="21"/>
                 <w:szCs w:val="21"/>
               </w:rPr>
-              <w:t xml:space="preserve">Adds a new record after showing the calculation.</w:t>
+              <w:t xml:space="preserve">Returns quantity × emission factor, rounded to 2 places.</w:t>
             </w:r>
           </w:p>
         </w:tc>
@@ -9033,7 +9033,7 @@
                 <w:sz w:val="21"/>
                 <w:szCs w:val="21"/>
               </w:rPr>
-              <w:t xml:space="preserve">print_records(records)</w:t>
+              <w:t xml:space="preserve">add_record()</w:t>
             </w:r>
           </w:p>
         </w:tc>
@@ -9062,7 +9062,7 @@
                 <w:sz w:val="21"/>
                 <w:szCs w:val="21"/>
               </w:rPr>
-              <w:t xml:space="preserve">Prints records as a formatted table.</w:t>
+              <w:t xml:space="preserve">Adds a new record after showing the calculation.</w:t>
             </w:r>
           </w:p>
         </w:tc>
@@ -9097,7 +9097,7 @@
                 <w:sz w:val="21"/>
                 <w:szCs w:val="21"/>
               </w:rPr>
-              <w:t xml:space="preserve">view_all_records()</w:t>
+              <w:t xml:space="preserve">print_records(records)</w:t>
             </w:r>
           </w:p>
         </w:tc>
@@ -9126,7 +9126,7 @@
                 <w:sz w:val="21"/>
                 <w:szCs w:val="21"/>
               </w:rPr>
-              <w:t xml:space="preserve">Displays all records using an INNER JOIN.</w:t>
+              <w:t xml:space="preserve">Prints records as a formatted table.</w:t>
             </w:r>
           </w:p>
         </w:tc>
@@ -9161,7 +9161,7 @@
                 <w:sz w:val="21"/>
                 <w:szCs w:val="21"/>
               </w:rPr>
-              <w:t xml:space="preserve">get_record(record_id)</w:t>
+              <w:t xml:space="preserve">view_all_records()</w:t>
             </w:r>
           </w:p>
         </w:tc>
@@ -9190,7 +9190,7 @@
                 <w:sz w:val="21"/>
                 <w:szCs w:val="21"/>
               </w:rPr>
-              <w:t xml:space="preserve">Fetches one record by its ID.</w:t>
+              <w:t xml:space="preserve">Displays all records using an INNER JOIN.</w:t>
             </w:r>
           </w:p>
         </w:tc>
@@ -9225,7 +9225,7 @@
                 <w:sz w:val="21"/>
                 <w:szCs w:val="21"/>
               </w:rPr>
-              <w:t xml:space="preserve">search_menu() and search_by_…()</w:t>
+              <w:t xml:space="preserve">get_record(record_id)</w:t>
             </w:r>
           </w:p>
         </w:tc>
@@ -9254,7 +9254,7 @@
                 <w:sz w:val="21"/>
                 <w:szCs w:val="21"/>
               </w:rPr>
-              <w:t xml:space="preserve">Search by ID, category (LIKE), date, or date range (BETWEEN).</w:t>
+              <w:t xml:space="preserve">Fetches one record by its ID.</w:t>
             </w:r>
           </w:p>
         </w:tc>
@@ -9289,7 +9289,7 @@
                 <w:sz w:val="21"/>
                 <w:szCs w:val="21"/>
               </w:rPr>
-              <w:t xml:space="preserve">update_record()</w:t>
+              <w:t xml:space="preserve">search_menu() and search_by_…()</w:t>
             </w:r>
           </w:p>
         </w:tc>
@@ -9318,7 +9318,7 @@
                 <w:sz w:val="21"/>
                 <w:szCs w:val="21"/>
               </w:rPr>
-              <w:t xml:space="preserve">Changes a record and recalculates its CO2.</w:t>
+              <w:t xml:space="preserve">Search by ID, category (LIKE), date, or date range (BETWEEN).</w:t>
             </w:r>
           </w:p>
         </w:tc>
@@ -9353,7 +9353,7 @@
                 <w:sz w:val="21"/>
                 <w:szCs w:val="21"/>
               </w:rPr>
-              <w:t xml:space="preserve">delete_record()</w:t>
+              <w:t xml:space="preserve">update_record()</w:t>
             </w:r>
           </w:p>
         </w:tc>
@@ -9382,7 +9382,7 @@
                 <w:sz w:val="21"/>
                 <w:szCs w:val="21"/>
               </w:rPr>
-              <w:t xml:space="preserve">Deletes a record after confirmation.</w:t>
+              <w:t xml:space="preserve">Changes a record and recalculates its CO2.</w:t>
             </w:r>
           </w:p>
         </w:tc>
@@ -9417,7 +9417,7 @@
                 <w:sz w:val="21"/>
                 <w:szCs w:val="21"/>
               </w:rPr>
-              <w:t xml:space="preserve">push(stack, item)</w:t>
+              <w:t xml:space="preserve">delete_record()</w:t>
             </w:r>
           </w:p>
         </w:tc>
@@ -9446,7 +9446,7 @@
                 <w:sz w:val="21"/>
                 <w:szCs w:val="21"/>
               </w:rPr>
-              <w:t xml:space="preserve">Adds an item to the top of the stack.</w:t>
+              <w:t xml:space="preserve">Deletes a record after confirmation.</w:t>
             </w:r>
           </w:p>
         </w:tc>
@@ -9481,7 +9481,7 @@
                 <w:sz w:val="21"/>
                 <w:szCs w:val="21"/>
               </w:rPr>
-              <w:t xml:space="preserve">pop(stack)</w:t>
+              <w:t xml:space="preserve">push(stack, item)</w:t>
             </w:r>
           </w:p>
         </w:tc>
@@ -9510,7 +9510,7 @@
                 <w:sz w:val="21"/>
                 <w:szCs w:val="21"/>
               </w:rPr>
-              <w:t xml:space="preserve">Removes and returns the top item, or None if the stack is empty.</w:t>
+              <w:t xml:space="preserve">Adds an item to the top of the stack.</w:t>
             </w:r>
           </w:p>
         </w:tc>
@@ -9545,7 +9545,7 @@
                 <w:sz w:val="21"/>
                 <w:szCs w:val="21"/>
               </w:rPr>
-              <w:t xml:space="preserve">undo_last_record()</w:t>
+              <w:t xml:space="preserve">pop(stack)</w:t>
             </w:r>
           </w:p>
         </w:tc>
@@ -9574,7 +9574,7 @@
                 <w:sz w:val="21"/>
                 <w:szCs w:val="21"/>
               </w:rPr>
-              <w:t xml:space="preserve">Pops the newest record ID and deletes that record after confirmation.</w:t>
+              <w:t xml:space="preserve">Removes and returns the top item, or None if the stack is empty.</w:t>
             </w:r>
           </w:p>
         </w:tc>
@@ -9609,7 +9609,7 @@
                 <w:sz w:val="21"/>
                 <w:szCs w:val="21"/>
               </w:rPr>
-              <w:t xml:space="preserve">get_overall_totals()</w:t>
+              <w:t xml:space="preserve">undo_last_record()</w:t>
             </w:r>
           </w:p>
         </w:tc>
@@ -9638,7 +9638,7 @@
                 <w:sz w:val="21"/>
                 <w:szCs w:val="21"/>
               </w:rPr>
-              <w:t xml:space="preserve">Runs COUNT, SUM, AVG, MIN and MAX on all records.</w:t>
+              <w:t xml:space="preserve">Pops the newest record ID and deletes that record after confirmation.</w:t>
             </w:r>
           </w:p>
         </w:tc>
@@ -9673,7 +9673,7 @@
                 <w:sz w:val="21"/>
                 <w:szCs w:val="21"/>
               </w:rPr>
-              <w:t xml:space="preserve">get_category_totals()</w:t>
+              <w:t xml:space="preserve">get_overall_totals()</w:t>
             </w:r>
           </w:p>
         </w:tc>
@@ -9702,7 +9702,7 @@
                 <w:sz w:val="21"/>
                 <w:szCs w:val="21"/>
               </w:rPr>
-              <w:t xml:space="preserve">Totals per category with GROUP BY, highest first.</w:t>
+              <w:t xml:space="preserve">Runs COUNT, SUM, AVG, MIN and MAX on all records.</w:t>
             </w:r>
           </w:p>
         </w:tc>
@@ -9737,7 +9737,7 @@
                 <w:sz w:val="21"/>
                 <w:szCs w:val="21"/>
               </w:rPr>
-              <w:t xml:space="preserve">get_grand_total(rows)</w:t>
+              <w:t xml:space="preserve">get_category_totals()</w:t>
             </w:r>
           </w:p>
         </w:tc>
@@ -9766,7 +9766,7 @@
                 <w:sz w:val="21"/>
                 <w:szCs w:val="21"/>
               </w:rPr>
-              <w:t xml:space="preserve">Adds the totals of all categories.</w:t>
+              <w:t xml:space="preserve">Totals per category with GROUP BY, highest first.</w:t>
             </w:r>
           </w:p>
         </w:tc>
@@ -9801,7 +9801,7 @@
                 <w:sz w:val="21"/>
                 <w:szCs w:val="21"/>
               </w:rPr>
-              <w:t xml:space="preserve">overall_summary()</w:t>
+              <w:t xml:space="preserve">get_grand_total(rows)</w:t>
             </w:r>
           </w:p>
         </w:tc>
@@ -9830,7 +9830,7 @@
                 <w:sz w:val="21"/>
                 <w:szCs w:val="21"/>
               </w:rPr>
-              <w:t xml:space="preserve">Displays the overall summary.</w:t>
+              <w:t xml:space="preserve">Adds the totals of all categories.</w:t>
             </w:r>
           </w:p>
         </w:tc>
@@ -9865,7 +9865,7 @@
                 <w:sz w:val="21"/>
                 <w:szCs w:val="21"/>
               </w:rPr>
-              <w:t xml:space="preserve">category_summary()</w:t>
+              <w:t xml:space="preserve">overall_summary()</w:t>
             </w:r>
           </w:p>
         </w:tc>
@@ -9894,7 +9894,7 @@
                 <w:sz w:val="21"/>
                 <w:szCs w:val="21"/>
               </w:rPr>
-              <w:t xml:space="preserve">Displays totals and percentage share by category.</w:t>
+              <w:t xml:space="preserve">Displays the overall summary.</w:t>
             </w:r>
           </w:p>
         </w:tc>
@@ -9929,7 +9929,7 @@
                 <w:sz w:val="21"/>
                 <w:szCs w:val="21"/>
               </w:rPr>
-              <w:t xml:space="preserve">show_available_months()</w:t>
+              <w:t xml:space="preserve">category_summary()</w:t>
             </w:r>
           </w:p>
         </w:tc>
@@ -9958,7 +9958,7 @@
                 <w:sz w:val="21"/>
                 <w:szCs w:val="21"/>
               </w:rPr>
-              <w:t xml:space="preserve">Lists months with records using DISTINCT.</w:t>
+              <w:t xml:space="preserve">Displays totals and percentage share by category.</w:t>
             </w:r>
           </w:p>
         </w:tc>
@@ -9993,7 +9993,7 @@
                 <w:sz w:val="21"/>
                 <w:szCs w:val="21"/>
               </w:rPr>
-              <w:t xml:space="preserve">monthly_summary()</w:t>
+              <w:t xml:space="preserve">show_available_months()</w:t>
             </w:r>
           </w:p>
         </w:tc>
@@ -10022,7 +10022,7 @@
                 <w:sz w:val="21"/>
                 <w:szCs w:val="21"/>
               </w:rPr>
-              <w:t xml:space="preserve">Summary for one chosen month.</w:t>
+              <w:t xml:space="preserve">Lists months with records using DISTINCT.</w:t>
             </w:r>
           </w:p>
         </w:tc>
@@ -10057,7 +10057,7 @@
                 <w:sz w:val="21"/>
                 <w:szCs w:val="21"/>
               </w:rPr>
-              <w:t xml:space="preserve">generate_suggestions(rows)</w:t>
+              <w:t xml:space="preserve">monthly_summary()</w:t>
             </w:r>
           </w:p>
         </w:tc>
@@ -10086,7 +10086,7 @@
                 <w:sz w:val="21"/>
                 <w:szCs w:val="21"/>
               </w:rPr>
-              <w:t xml:space="preserve">Rule-based tips for categories with 20% or more of total CO2.</w:t>
+              <w:t xml:space="preserve">Summary for one chosen month.</w:t>
             </w:r>
           </w:p>
         </w:tc>
@@ -10121,7 +10121,7 @@
                 <w:sz w:val="21"/>
                 <w:szCs w:val="21"/>
               </w:rPr>
-              <w:t xml:space="preserve">highest_emission_category()</w:t>
+              <w:t xml:space="preserve">generate_suggestions(rows)</w:t>
             </w:r>
           </w:p>
         </w:tc>
@@ -10150,7 +10150,7 @@
                 <w:sz w:val="21"/>
                 <w:szCs w:val="21"/>
               </w:rPr>
-              <w:t xml:space="preserve">Shows the highest and lowest categories and suggestions.</w:t>
+              <w:t xml:space="preserve">Rule-based tips for categories with 20% or more of total CO2.</w:t>
             </w:r>
           </w:p>
         </w:tc>
@@ -10185,7 +10185,7 @@
                 <w:sz w:val="21"/>
                 <w:szCs w:val="21"/>
               </w:rPr>
-              <w:t xml:space="preserve">export_to_csv()</w:t>
+              <w:t xml:space="preserve">highest_emission_category()</w:t>
             </w:r>
           </w:p>
         </w:tc>
@@ -10214,7 +10214,7 @@
                 <w:sz w:val="21"/>
                 <w:szCs w:val="21"/>
               </w:rPr>
-              <w:t xml:space="preserve">Writes all records to carbon_records.csv.</w:t>
+              <w:t xml:space="preserve">Shows the highest and lowest categories and suggestions.</w:t>
             </w:r>
           </w:p>
         </w:tc>
@@ -10249,7 +10249,7 @@
                 <w:sz w:val="21"/>
                 <w:szCs w:val="21"/>
               </w:rPr>
-              <w:t xml:space="preserve">export_summary_to_text()</w:t>
+              <w:t xml:space="preserve">export_to_csv()</w:t>
             </w:r>
           </w:p>
         </w:tc>
@@ -10278,7 +10278,7 @@
                 <w:sz w:val="21"/>
                 <w:szCs w:val="21"/>
               </w:rPr>
-              <w:t xml:space="preserve">Writes a summary report to carbon_summary.txt.</w:t>
+              <w:t xml:space="preserve">Writes all records to carbon_records.csv.</w:t>
             </w:r>
           </w:p>
         </w:tc>
@@ -10313,7 +10313,7 @@
                 <w:sz w:val="21"/>
                 <w:szCs w:val="21"/>
               </w:rPr>
-              <w:t xml:space="preserve">update_emission_factor()</w:t>
+              <w:t xml:space="preserve">export_summary_to_text()</w:t>
             </w:r>
           </w:p>
         </w:tc>
@@ -10342,7 +10342,7 @@
                 <w:sz w:val="21"/>
                 <w:szCs w:val="21"/>
               </w:rPr>
-              <w:t xml:space="preserve">Changes the factor of a category.</w:t>
+              <w:t xml:space="preserve">Writes a summary report to carbon_summary.txt.</w:t>
             </w:r>
           </w:p>
         </w:tc>
@@ -10377,7 +10377,7 @@
                 <w:sz w:val="21"/>
                 <w:szCs w:val="21"/>
               </w:rPr>
-              <w:t xml:space="preserve">add_category()</w:t>
+              <w:t xml:space="preserve">update_emission_factor()</w:t>
             </w:r>
           </w:p>
         </w:tc>
@@ -10406,7 +10406,7 @@
                 <w:sz w:val="21"/>
                 <w:szCs w:val="21"/>
               </w:rPr>
-              <w:t xml:space="preserve">Adds a new category with checks for length and duplicates.</w:t>
+              <w:t xml:space="preserve">Changes the factor of a category.</w:t>
             </w:r>
           </w:p>
         </w:tc>
@@ -10441,7 +10441,7 @@
                 <w:sz w:val="21"/>
                 <w:szCs w:val="21"/>
               </w:rPr>
-              <w:t xml:space="preserve">manage_emission_factors()</w:t>
+              <w:t xml:space="preserve">add_category()</w:t>
             </w:r>
           </w:p>
         </w:tc>
@@ -10470,7 +10470,7 @@
                 <w:sz w:val="21"/>
                 <w:szCs w:val="21"/>
               </w:rPr>
-              <w:t xml:space="preserve">Sub-menu for viewing and managing factors.</w:t>
+              <w:t xml:space="preserve">Adds a new category; name at most 15 characters, unit at most 6, no duplicates.</w:t>
             </w:r>
           </w:p>
         </w:tc>
@@ -10505,7 +10505,7 @@
                 <w:sz w:val="21"/>
                 <w:szCs w:val="21"/>
               </w:rPr>
-              <w:t xml:space="preserve">show_help()</w:t>
+              <w:t xml:space="preserve">manage_emission_factors()</w:t>
             </w:r>
           </w:p>
         </w:tc>
@@ -10534,7 +10534,7 @@
                 <w:sz w:val="21"/>
                 <w:szCs w:val="21"/>
               </w:rPr>
-              <w:t xml:space="preserve">Displays help text.</w:t>
+              <w:t xml:space="preserve">Sub-menu for viewing and managing factors.</w:t>
             </w:r>
           </w:p>
         </w:tc>
@@ -10569,7 +10569,7 @@
                 <w:sz w:val="21"/>
                 <w:szCs w:val="21"/>
               </w:rPr>
-              <w:t xml:space="preserve">display_main_menu()</w:t>
+              <w:t xml:space="preserve">show_help()</w:t>
             </w:r>
           </w:p>
         </w:tc>
@@ -10598,7 +10598,7 @@
                 <w:sz w:val="21"/>
                 <w:szCs w:val="21"/>
               </w:rPr>
-              <w:t xml:space="preserve">Prints the main menu.</w:t>
+              <w:t xml:space="preserve">Displays help text.</w:t>
             </w:r>
           </w:p>
         </w:tc>
@@ -10633,6 +10633,70 @@
                 <w:sz w:val="21"/>
                 <w:szCs w:val="21"/>
               </w:rPr>
+              <w:t xml:space="preserve">display_main_menu()</w:t>
+            </w:r>
+          </w:p>
+        </w:tc>
+        <w:tc>
+          <w:tcPr>
+            <w:tcW w:type="dxa" w:w="6338"/>
+            <w:tcBorders>
+              <w:top w:val="single" w:color="808080" w:sz="4"/>
+              <w:left w:val="single" w:color="808080" w:sz="4"/>
+              <w:bottom w:val="single" w:color="808080" w:sz="4"/>
+              <w:right w:val="single" w:color="808080" w:sz="4"/>
+            </w:tcBorders>
+            <w:tcMar>
+              <w:top w:type="dxa" w:w="60"/>
+              <w:left w:type="dxa" w:w="100"/>
+              <w:bottom w:type="dxa" w:w="60"/>
+              <w:right w:type="dxa" w:w="100"/>
+            </w:tcMar>
+          </w:tcPr>
+          <w:p>
+            <w:r>
+              <w:rPr>
+                <w:rFonts w:ascii="Times New Roman" w:cs="Times New Roman" w:eastAsia="Times New Roman" w:hAnsi="Times New Roman"/>
+                <w:b w:val="false"/>
+                <w:bCs w:val="false"/>
+                <w:sz w:val="21"/>
+                <w:szCs w:val="21"/>
+              </w:rPr>
+              <w:t xml:space="preserve">Prints the main menu.</w:t>
+            </w:r>
+          </w:p>
+        </w:tc>
+      </w:tr>
+      <w:tr>
+        <w:trPr>
+          <w:cantSplit/>
+          <w:tblHeader w:val="false"/>
+        </w:trPr>
+        <w:tc>
+          <w:tcPr>
+            <w:tcW w:type="dxa" w:w="3300"/>
+            <w:tcBorders>
+              <w:top w:val="single" w:color="808080" w:sz="4"/>
+              <w:left w:val="single" w:color="808080" w:sz="4"/>
+              <w:bottom w:val="single" w:color="808080" w:sz="4"/>
+              <w:right w:val="single" w:color="808080" w:sz="4"/>
+            </w:tcBorders>
+            <w:tcMar>
+              <w:top w:type="dxa" w:w="60"/>
+              <w:left w:type="dxa" w:w="100"/>
+              <w:bottom w:type="dxa" w:w="60"/>
+              <w:right w:type="dxa" w:w="100"/>
+            </w:tcMar>
+          </w:tcPr>
+          <w:p>
+            <w:r>
+              <w:rPr>
+                <w:rFonts w:ascii="Courier New" w:cs="Courier New" w:eastAsia="Courier New" w:hAnsi="Courier New"/>
+                <w:b w:val="false"/>
+                <w:bCs w:val="false"/>
+                <w:sz w:val="21"/>
+                <w:szCs w:val="21"/>
+              </w:rPr>
               <w:t xml:space="preserve">main()</w:t>
             </w:r>
           </w:p>
@@ -13581,6 +13645,19 @@
           <w:sz w:val="16"/>
           <w:szCs w:val="16"/>
         </w:rPr>
+        <w:t xml:space="preserve"># Ask a yes/no question until the user answers Y/YES or N/NO</w:t>
+      </w:r>
+    </w:p>
+    <w:p>
+      <w:pPr>
+        <w:spacing w:after="0" w:line="228"/>
+      </w:pPr>
+      <w:r>
+        <w:rPr>
+          <w:rFonts w:ascii="Courier New" w:cs="Courier New" w:eastAsia="Courier New" w:hAnsi="Courier New"/>
+          <w:sz w:val="16"/>
+          <w:szCs w:val="16"/>
+        </w:rPr>
         <w:t xml:space="preserve">def ask_yes_no(prompt):</w:t>
       </w:r>
     </w:p>
@@ -13594,20 +13671,98 @@
           <w:sz w:val="16"/>
           <w:szCs w:val="16"/>
         </w:rPr>
-        <w:t xml:space="preserve">    answer = input(prompt + " (Y/N): ").strip().upper()</w:t>
-      </w:r>
-    </w:p>
-    <w:p>
-      <w:pPr>
-        <w:spacing w:after="0" w:line="228"/>
-      </w:pPr>
-      <w:r>
-        <w:rPr>
-          <w:rFonts w:ascii="Courier New" w:cs="Courier New" w:eastAsia="Courier New" w:hAnsi="Courier New"/>
-          <w:sz w:val="16"/>
-          <w:szCs w:val="16"/>
-        </w:rPr>
-        <w:t xml:space="preserve">    return answer == "Y"</w:t>
+        <w:t xml:space="preserve">    while True:</w:t>
+      </w:r>
+    </w:p>
+    <w:p>
+      <w:pPr>
+        <w:spacing w:after="0" w:line="228"/>
+      </w:pPr>
+      <w:r>
+        <w:rPr>
+          <w:rFonts w:ascii="Courier New" w:cs="Courier New" w:eastAsia="Courier New" w:hAnsi="Courier New"/>
+          <w:sz w:val="16"/>
+          <w:szCs w:val="16"/>
+        </w:rPr>
+        <w:t xml:space="preserve">        answer = input(prompt + " (Y/N): ").strip().upper()</w:t>
+      </w:r>
+    </w:p>
+    <w:p>
+      <w:pPr>
+        <w:spacing w:after="0" w:line="228"/>
+      </w:pPr>
+      <w:r>
+        <w:rPr>
+          <w:rFonts w:ascii="Courier New" w:cs="Courier New" w:eastAsia="Courier New" w:hAnsi="Courier New"/>
+          <w:sz w:val="16"/>
+          <w:szCs w:val="16"/>
+        </w:rPr>
+        <w:t xml:space="preserve">        if answer == "Y" or answer == "YES":</w:t>
+      </w:r>
+    </w:p>
+    <w:p>
+      <w:pPr>
+        <w:spacing w:after="0" w:line="228"/>
+      </w:pPr>
+      <w:r>
+        <w:rPr>
+          <w:rFonts w:ascii="Courier New" w:cs="Courier New" w:eastAsia="Courier New" w:hAnsi="Courier New"/>
+          <w:sz w:val="16"/>
+          <w:szCs w:val="16"/>
+        </w:rPr>
+        <w:t xml:space="preserve">            return True</w:t>
+      </w:r>
+    </w:p>
+    <w:p>
+      <w:pPr>
+        <w:spacing w:after="0" w:line="228"/>
+      </w:pPr>
+      <w:r>
+        <w:rPr>
+          <w:rFonts w:ascii="Courier New" w:cs="Courier New" w:eastAsia="Courier New" w:hAnsi="Courier New"/>
+          <w:sz w:val="16"/>
+          <w:szCs w:val="16"/>
+        </w:rPr>
+        <w:t xml:space="preserve">        elif answer == "N" or answer == "NO":</w:t>
+      </w:r>
+    </w:p>
+    <w:p>
+      <w:pPr>
+        <w:spacing w:after="0" w:line="228"/>
+      </w:pPr>
+      <w:r>
+        <w:rPr>
+          <w:rFonts w:ascii="Courier New" w:cs="Courier New" w:eastAsia="Courier New" w:hAnsi="Courier New"/>
+          <w:sz w:val="16"/>
+          <w:szCs w:val="16"/>
+        </w:rPr>
+        <w:t xml:space="preserve">            return False</w:t>
+      </w:r>
+    </w:p>
+    <w:p>
+      <w:pPr>
+        <w:spacing w:after="0" w:line="228"/>
+      </w:pPr>
+      <w:r>
+        <w:rPr>
+          <w:rFonts w:ascii="Courier New" w:cs="Courier New" w:eastAsia="Courier New" w:hAnsi="Courier New"/>
+          <w:sz w:val="16"/>
+          <w:szCs w:val="16"/>
+        </w:rPr>
+        <w:t xml:space="preserve">        else:</w:t>
+      </w:r>
+    </w:p>
+    <w:p>
+      <w:pPr>
+        <w:spacing w:after="0" w:line="228"/>
+      </w:pPr>
+      <w:r>
+        <w:rPr>
+          <w:rFonts w:ascii="Courier New" w:cs="Courier New" w:eastAsia="Courier New" w:hAnsi="Courier New"/>
+          <w:sz w:val="16"/>
+          <w:szCs w:val="16"/>
+        </w:rPr>
+        <w:t xml:space="preserve">            print("Please type Y for yes or N for no.")</w:t>
       </w:r>
     </w:p>
     <w:p>
@@ -19964,20 +20119,33 @@
           <w:sz w:val="16"/>
           <w:szCs w:val="16"/>
         </w:rPr>
-        <w:t xml:space="preserve">    if len(name) &gt; 30 or len(unit) &gt; 10:</w:t>
-      </w:r>
-    </w:p>
-    <w:p>
-      <w:pPr>
-        <w:spacing w:after="0" w:line="228"/>
-      </w:pPr>
-      <w:r>
-        <w:rPr>
-          <w:rFonts w:ascii="Courier New" w:cs="Courier New" w:eastAsia="Courier New" w:hAnsi="Courier New"/>
-          <w:sz w:val="16"/>
-          <w:szCs w:val="16"/>
-        </w:rPr>
-        <w:t xml:space="preserve">        print("Name can have at most 30 characters and unit at most 10.")</w:t>
+        <w:t xml:space="preserve">    # These limits keep the category tables neatly lined up</w:t>
+      </w:r>
+    </w:p>
+    <w:p>
+      <w:pPr>
+        <w:spacing w:after="0" w:line="228"/>
+      </w:pPr>
+      <w:r>
+        <w:rPr>
+          <w:rFonts w:ascii="Courier New" w:cs="Courier New" w:eastAsia="Courier New" w:hAnsi="Courier New"/>
+          <w:sz w:val="16"/>
+          <w:szCs w:val="16"/>
+        </w:rPr>
+        <w:t xml:space="preserve">    if len(name) &gt; 15 or len(unit) &gt; 6:</w:t>
+      </w:r>
+    </w:p>
+    <w:p>
+      <w:pPr>
+        <w:spacing w:after="0" w:line="228"/>
+      </w:pPr>
+      <w:r>
+        <w:rPr>
+          <w:rFonts w:ascii="Courier New" w:cs="Courier New" w:eastAsia="Courier New" w:hAnsi="Courier New"/>
+          <w:sz w:val="16"/>
+          <w:szCs w:val="16"/>
+        </w:rPr>
+        <w:t xml:space="preserve">        print("Name can have at most 15 characters and unit at most 6.")</w:t>
       </w:r>
     </w:p>
     <w:p>
@@ -26006,6 +26174,250 @@
                 <w:szCs w:val="21"/>
               </w:rPr>
               <w:t xml:space="preserve">"Database error" shown, stays in menu 12</w:t>
+            </w:r>
+          </w:p>
+        </w:tc>
+      </w:tr>
+      <w:tr>
+        <w:trPr>
+          <w:cantSplit/>
+          <w:tblHeader w:val="false"/>
+        </w:trPr>
+        <w:tc>
+          <w:tcPr>
+            <w:tcW w:type="dxa" w:w="600"/>
+            <w:tcBorders>
+              <w:top w:val="single" w:color="808080" w:sz="4"/>
+              <w:left w:val="single" w:color="808080" w:sz="4"/>
+              <w:bottom w:val="single" w:color="808080" w:sz="4"/>
+              <w:right w:val="single" w:color="808080" w:sz="4"/>
+            </w:tcBorders>
+            <w:tcMar>
+              <w:top w:type="dxa" w:w="60"/>
+              <w:left w:type="dxa" w:w="100"/>
+              <w:bottom w:type="dxa" w:w="60"/>
+              <w:right w:type="dxa" w:w="100"/>
+            </w:tcMar>
+          </w:tcPr>
+          <w:p>
+            <w:r>
+              <w:rPr>
+                <w:rFonts w:ascii="Times New Roman" w:cs="Times New Roman" w:eastAsia="Times New Roman" w:hAnsi="Times New Roman"/>
+                <w:b w:val="false"/>
+                <w:bCs w:val="false"/>
+                <w:sz w:val="21"/>
+                <w:szCs w:val="21"/>
+              </w:rPr>
+              <w:t xml:space="preserve">27</w:t>
+            </w:r>
+          </w:p>
+        </w:tc>
+        <w:tc>
+          <w:tcPr>
+            <w:tcW w:type="dxa" w:w="3000"/>
+            <w:tcBorders>
+              <w:top w:val="single" w:color="808080" w:sz="4"/>
+              <w:left w:val="single" w:color="808080" w:sz="4"/>
+              <w:bottom w:val="single" w:color="808080" w:sz="4"/>
+              <w:right w:val="single" w:color="808080" w:sz="4"/>
+            </w:tcBorders>
+            <w:tcMar>
+              <w:top w:type="dxa" w:w="60"/>
+              <w:left w:type="dxa" w:w="100"/>
+              <w:bottom w:type="dxa" w:w="60"/>
+              <w:right w:type="dxa" w:w="100"/>
+            </w:tcMar>
+          </w:tcPr>
+          <w:p>
+            <w:r>
+              <w:rPr>
+                <w:rFonts w:ascii="Times New Roman" w:cs="Times New Roman" w:eastAsia="Times New Roman" w:hAnsi="Times New Roman"/>
+                <w:b w:val="false"/>
+                <w:bCs w:val="false"/>
+                <w:sz w:val="21"/>
+                <w:szCs w:val="21"/>
+              </w:rPr>
+              <w:t xml:space="preserve">Answer "yes" or "maybe" at a Y/N prompt</w:t>
+            </w:r>
+          </w:p>
+        </w:tc>
+        <w:tc>
+          <w:tcPr>
+            <w:tcW w:type="dxa" w:w="3200"/>
+            <w:tcBorders>
+              <w:top w:val="single" w:color="808080" w:sz="4"/>
+              <w:left w:val="single" w:color="808080" w:sz="4"/>
+              <w:bottom w:val="single" w:color="808080" w:sz="4"/>
+              <w:right w:val="single" w:color="808080" w:sz="4"/>
+            </w:tcBorders>
+            <w:tcMar>
+              <w:top w:type="dxa" w:w="60"/>
+              <w:left w:type="dxa" w:w="100"/>
+              <w:bottom w:type="dxa" w:w="60"/>
+              <w:right w:type="dxa" w:w="100"/>
+            </w:tcMar>
+          </w:tcPr>
+          <w:p>
+            <w:r>
+              <w:rPr>
+                <w:rFonts w:ascii="Times New Roman" w:cs="Times New Roman" w:eastAsia="Times New Roman" w:hAnsi="Times New Roman"/>
+                <w:b w:val="false"/>
+                <w:bCs w:val="false"/>
+                <w:sz w:val="21"/>
+                <w:szCs w:val="21"/>
+              </w:rPr>
+              <w:t xml:space="preserve">yes, Yes, maybe</w:t>
+            </w:r>
+          </w:p>
+        </w:tc>
+        <w:tc>
+          <w:tcPr>
+            <w:tcW w:type="dxa" w:w="2838"/>
+            <w:tcBorders>
+              <w:top w:val="single" w:color="808080" w:sz="4"/>
+              <w:left w:val="single" w:color="808080" w:sz="4"/>
+              <w:bottom w:val="single" w:color="808080" w:sz="4"/>
+              <w:right w:val="single" w:color="808080" w:sz="4"/>
+            </w:tcBorders>
+            <w:tcMar>
+              <w:top w:type="dxa" w:w="60"/>
+              <w:left w:type="dxa" w:w="100"/>
+              <w:bottom w:type="dxa" w:w="60"/>
+              <w:right w:type="dxa" w:w="100"/>
+            </w:tcMar>
+          </w:tcPr>
+          <w:p>
+            <w:r>
+              <w:rPr>
+                <w:rFonts w:ascii="Times New Roman" w:cs="Times New Roman" w:eastAsia="Times New Roman" w:hAnsi="Times New Roman"/>
+                <w:b w:val="false"/>
+                <w:bCs w:val="false"/>
+                <w:sz w:val="21"/>
+                <w:szCs w:val="21"/>
+              </w:rPr>
+              <w:t xml:space="preserve">"yes"/"Yes" accepted; "maybe" asks again</w:t>
+            </w:r>
+          </w:p>
+        </w:tc>
+      </w:tr>
+      <w:tr>
+        <w:trPr>
+          <w:cantSplit/>
+          <w:tblHeader w:val="false"/>
+        </w:trPr>
+        <w:tc>
+          <w:tcPr>
+            <w:tcW w:type="dxa" w:w="600"/>
+            <w:tcBorders>
+              <w:top w:val="single" w:color="808080" w:sz="4"/>
+              <w:left w:val="single" w:color="808080" w:sz="4"/>
+              <w:bottom w:val="single" w:color="808080" w:sz="4"/>
+              <w:right w:val="single" w:color="808080" w:sz="4"/>
+            </w:tcBorders>
+            <w:tcMar>
+              <w:top w:type="dxa" w:w="60"/>
+              <w:left w:type="dxa" w:w="100"/>
+              <w:bottom w:type="dxa" w:w="60"/>
+              <w:right w:type="dxa" w:w="100"/>
+            </w:tcMar>
+          </w:tcPr>
+          <w:p>
+            <w:r>
+              <w:rPr>
+                <w:rFonts w:ascii="Times New Roman" w:cs="Times New Roman" w:eastAsia="Times New Roman" w:hAnsi="Times New Roman"/>
+                <w:b w:val="false"/>
+                <w:bCs w:val="false"/>
+                <w:sz w:val="21"/>
+                <w:szCs w:val="21"/>
+              </w:rPr>
+              <w:t xml:space="preserve">28</w:t>
+            </w:r>
+          </w:p>
+        </w:tc>
+        <w:tc>
+          <w:tcPr>
+            <w:tcW w:type="dxa" w:w="3000"/>
+            <w:tcBorders>
+              <w:top w:val="single" w:color="808080" w:sz="4"/>
+              <w:left w:val="single" w:color="808080" w:sz="4"/>
+              <w:bottom w:val="single" w:color="808080" w:sz="4"/>
+              <w:right w:val="single" w:color="808080" w:sz="4"/>
+            </w:tcBorders>
+            <w:tcMar>
+              <w:top w:type="dxa" w:w="60"/>
+              <w:left w:type="dxa" w:w="100"/>
+              <w:bottom w:type="dxa" w:w="60"/>
+              <w:right w:type="dxa" w:w="100"/>
+            </w:tcMar>
+          </w:tcPr>
+          <w:p>
+            <w:r>
+              <w:rPr>
+                <w:rFonts w:ascii="Times New Roman" w:cs="Times New Roman" w:eastAsia="Times New Roman" w:hAnsi="Times New Roman"/>
+                <w:b w:val="false"/>
+                <w:bCs w:val="false"/>
+                <w:sz w:val="21"/>
+                <w:szCs w:val="21"/>
+              </w:rPr>
+              <w:t xml:space="preserve">Long category name or unit</w:t>
+            </w:r>
+          </w:p>
+        </w:tc>
+        <w:tc>
+          <w:tcPr>
+            <w:tcW w:type="dxa" w:w="3200"/>
+            <w:tcBorders>
+              <w:top w:val="single" w:color="808080" w:sz="4"/>
+              <w:left w:val="single" w:color="808080" w:sz="4"/>
+              <w:bottom w:val="single" w:color="808080" w:sz="4"/>
+              <w:right w:val="single" w:color="808080" w:sz="4"/>
+            </w:tcBorders>
+            <w:tcMar>
+              <w:top w:type="dxa" w:w="60"/>
+              <w:left w:type="dxa" w:w="100"/>
+              <w:bottom w:type="dxa" w:w="60"/>
+              <w:right w:type="dxa" w:w="100"/>
+            </w:tcMar>
+          </w:tcPr>
+          <w:p>
+            <w:r>
+              <w:rPr>
+                <w:rFonts w:ascii="Times New Roman" w:cs="Times New Roman" w:eastAsia="Times New Roman" w:hAnsi="Times New Roman"/>
+                <w:b w:val="false"/>
+                <w:bCs w:val="false"/>
+                <w:sz w:val="21"/>
+                <w:szCs w:val="21"/>
+              </w:rPr>
+              <w:t xml:space="preserve">16-character name, 7-letter unit</w:t>
+            </w:r>
+          </w:p>
+        </w:tc>
+        <w:tc>
+          <w:tcPr>
+            <w:tcW w:type="dxa" w:w="2838"/>
+            <w:tcBorders>
+              <w:top w:val="single" w:color="808080" w:sz="4"/>
+              <w:left w:val="single" w:color="808080" w:sz="4"/>
+              <w:bottom w:val="single" w:color="808080" w:sz="4"/>
+              <w:right w:val="single" w:color="808080" w:sz="4"/>
+            </w:tcBorders>
+            <w:tcMar>
+              <w:top w:type="dxa" w:w="60"/>
+              <w:left w:type="dxa" w:w="100"/>
+              <w:bottom w:type="dxa" w:w="60"/>
+              <w:right w:type="dxa" w:w="100"/>
+            </w:tcMar>
+          </w:tcPr>
+          <w:p>
+            <w:r>
+              <w:rPr>
+                <w:rFonts w:ascii="Times New Roman" w:cs="Times New Roman" w:eastAsia="Times New Roman" w:hAnsi="Times New Roman"/>
+                <w:b w:val="false"/>
+                <w:bCs w:val="false"/>
+                <w:sz w:val="21"/>
+                <w:szCs w:val="21"/>
+              </w:rPr>
+              <w:t xml:space="preserve">"at most 15 characters and unit at most 6"</w:t>
             </w:r>
           </w:p>
         </w:tc>

</xml_diff>